<commit_message>
Deploying to gh-pages from @ marinopagan/pagan_lab@9d4591894b9f63859289e9b3dcf27070077fa410 🚀
</commit_message>
<xml_diff>
--- a/assets/CV_Pagan.docx
+++ b/assets/CV_Pagan.docx
@@ -1,6 +1,6 @@
 
 <file path=word/document.xml><?xml version="1.0" encoding="utf-8"?>
-<w:document xmlns:wpc="http://schemas.microsoft.com/office/word/2010/wordprocessingCanvas" xmlns:cx="http://schemas.microsoft.com/office/drawing/2014/chartex" xmlns:cx1="http://schemas.microsoft.com/office/drawing/2015/9/8/chartex" xmlns:cx2="http://schemas.microsoft.com/office/drawing/2015/10/21/chartex" xmlns:cx3="http://schemas.microsoft.com/office/drawing/2016/5/9/chartex" xmlns:cx4="http://schemas.microsoft.com/office/drawing/2016/5/10/chartex" xmlns:cx5="http://schemas.microsoft.com/office/drawing/2016/5/11/chartex" xmlns:cx6="http://schemas.microsoft.com/office/drawing/2016/5/12/chartex" xmlns:cx7="http://schemas.microsoft.com/office/drawing/2016/5/13/chartex" xmlns:cx8="http://schemas.microsoft.com/office/drawing/2016/5/14/chartex" xmlns:mc="http://schemas.openxmlformats.org/markup-compatibility/2006" xmlns:aink="http://schemas.microsoft.com/office/drawing/2016/ink" xmlns:am3d="http://schemas.microsoft.com/office/drawing/2017/model3d" xmlns:o="urn:schemas-microsoft-com:office:office" xmlns:oel="http://schemas.microsoft.com/office/2019/extlst" xmlns:r="http://schemas.openxmlformats.org/officeDocument/2006/relationships" xmlns:m="http://schemas.openxmlformats.org/officeDocument/2006/math" xmlns:v="urn:schemas-microsoft-com:vml" xmlns:wp14="http://schemas.microsoft.com/office/word/2010/wordprocessingDrawing" xmlns:wp="http://schemas.openxmlformats.org/drawingml/2006/wordprocessingDrawing" xmlns:w10="urn:schemas-microsoft-com:office:word" xmlns:w="http://schemas.openxmlformats.org/wordprocessingml/2006/main" xmlns:w14="http://schemas.microsoft.com/office/word/2010/wordml" xmlns:w15="http://schemas.microsoft.com/office/word/2012/wordml" xmlns:w16cex="http://schemas.microsoft.com/office/word/2018/wordml/cex" xmlns:w16cid="http://schemas.microsoft.com/office/word/2016/wordml/cid" xmlns:w16="http://schemas.microsoft.com/office/word/2018/wordml" xmlns:w16du="http://schemas.microsoft.com/office/word/2023/wordml/word16du" xmlns:w16sdtdh="http://schemas.microsoft.com/office/word/2020/wordml/sdtdatahash" xmlns:w16se="http://schemas.microsoft.com/office/word/2015/wordml/symex" xmlns:wpg="http://schemas.microsoft.com/office/word/2010/wordprocessingGroup" xmlns:wpi="http://schemas.microsoft.com/office/word/2010/wordprocessingInk" xmlns:wne="http://schemas.microsoft.com/office/word/2006/wordml" xmlns:wps="http://schemas.microsoft.com/office/word/2010/wordprocessingShape" mc:Ignorable="w14 w15 w16se w16cid w16 w16cex w16sdtdh w16du wp14">
+<w:document xmlns:wpc="http://schemas.microsoft.com/office/word/2010/wordprocessingCanvas" xmlns:cx="http://schemas.microsoft.com/office/drawing/2014/chartex" xmlns:cx1="http://schemas.microsoft.com/office/drawing/2015/9/8/chartex" xmlns:cx2="http://schemas.microsoft.com/office/drawing/2015/10/21/chartex" xmlns:cx3="http://schemas.microsoft.com/office/drawing/2016/5/9/chartex" xmlns:cx4="http://schemas.microsoft.com/office/drawing/2016/5/10/chartex" xmlns:cx5="http://schemas.microsoft.com/office/drawing/2016/5/11/chartex" xmlns:cx6="http://schemas.microsoft.com/office/drawing/2016/5/12/chartex" xmlns:cx7="http://schemas.microsoft.com/office/drawing/2016/5/13/chartex" xmlns:cx8="http://schemas.microsoft.com/office/drawing/2016/5/14/chartex" xmlns:mc="http://schemas.openxmlformats.org/markup-compatibility/2006" xmlns:aink="http://schemas.microsoft.com/office/drawing/2016/ink" xmlns:am3d="http://schemas.microsoft.com/office/drawing/2017/model3d" xmlns:o="urn:schemas-microsoft-com:office:office" xmlns:oel="http://schemas.microsoft.com/office/2019/extlst" xmlns:r="http://schemas.openxmlformats.org/officeDocument/2006/relationships" xmlns:m="http://schemas.openxmlformats.org/officeDocument/2006/math" xmlns:v="urn:schemas-microsoft-com:vml" xmlns:wp14="http://schemas.microsoft.com/office/word/2010/wordprocessingDrawing" xmlns:wp="http://schemas.openxmlformats.org/drawingml/2006/wordprocessingDrawing" xmlns:w10="urn:schemas-microsoft-com:office:word" xmlns:w="http://schemas.openxmlformats.org/wordprocessingml/2006/main" xmlns:w14="http://schemas.microsoft.com/office/word/2010/wordml" xmlns:w15="http://schemas.microsoft.com/office/word/2012/wordml" xmlns:w16cex="http://schemas.microsoft.com/office/word/2018/wordml/cex" xmlns:w16cid="http://schemas.microsoft.com/office/word/2016/wordml/cid" xmlns:w16="http://schemas.microsoft.com/office/word/2018/wordml" xmlns:w16du="http://schemas.microsoft.com/office/word/2023/wordml/word16du" xmlns:w16sdtdh="http://schemas.microsoft.com/office/word/2020/wordml/sdtdatahash" xmlns:w16sdtfl="http://schemas.microsoft.com/office/word/2024/wordml/sdtformatlock" xmlns:w16se="http://schemas.microsoft.com/office/word/2015/wordml/symex" xmlns:wpg="http://schemas.microsoft.com/office/word/2010/wordprocessingGroup" xmlns:wpi="http://schemas.microsoft.com/office/word/2010/wordprocessingInk" xmlns:wne="http://schemas.microsoft.com/office/word/2006/wordml" xmlns:wps="http://schemas.microsoft.com/office/word/2010/wordprocessingShape" mc:Ignorable="w14 w15 w16se w16cid w16 w16cex w16sdtdh w16sdtfl w16du wp14">
   <w:body>
     <w:p>
       <w:pPr>
@@ -268,23 +268,13 @@
           <w:szCs w:val="22"/>
         </w:rPr>
       </w:pPr>
-      <w:proofErr w:type="spellStart"/>
-      <w:r>
-        <w:rPr>
-          <w:rFonts w:ascii="Arial" w:hAnsi="Arial" w:cs="Arial"/>
-          <w:sz w:val="22"/>
-          <w:szCs w:val="22"/>
-        </w:rPr>
-        <w:t>Laurea</w:t>
-      </w:r>
-      <w:proofErr w:type="spellEnd"/>
-      <w:r>
-        <w:rPr>
-          <w:rFonts w:ascii="Arial" w:hAnsi="Arial" w:cs="Arial"/>
-          <w:sz w:val="22"/>
-          <w:szCs w:val="22"/>
-        </w:rPr>
-        <w:t xml:space="preserve"> (B.S.) in Computer Engineering</w:t>
+      <w:r>
+        <w:rPr>
+          <w:rFonts w:ascii="Arial" w:hAnsi="Arial" w:cs="Arial"/>
+          <w:sz w:val="22"/>
+          <w:szCs w:val="22"/>
+        </w:rPr>
+        <w:t>Laurea (B.S.) in Computer Engineering</w:t>
       </w:r>
       <w:r>
         <w:rPr>
@@ -327,18 +317,8 @@
           <w:sz w:val="22"/>
           <w:szCs w:val="22"/>
         </w:rPr>
-        <w:t xml:space="preserve">: Dr. Bruno </w:t>
-      </w:r>
-      <w:proofErr w:type="spellStart"/>
-      <w:r>
-        <w:rPr>
-          <w:rFonts w:ascii="Arial" w:hAnsi="Arial" w:cs="Arial"/>
-          <w:sz w:val="22"/>
-          <w:szCs w:val="22"/>
-        </w:rPr>
-        <w:t>Codenotti</w:t>
-      </w:r>
-      <w:proofErr w:type="spellEnd"/>
+        <w:t>: Dr. Bruno Codenotti</w:t>
+      </w:r>
       <w:r>
         <w:rPr>
           <w:rFonts w:ascii="Arial" w:hAnsi="Arial" w:cs="Arial"/>
@@ -512,6 +492,14 @@
           <w:szCs w:val="22"/>
         </w:rPr>
       </w:pPr>
+      <w:r>
+        <w:rPr>
+          <w:rFonts w:ascii="Arial" w:hAnsi="Arial" w:cs="Arial"/>
+          <w:sz w:val="22"/>
+          <w:szCs w:val="22"/>
+        </w:rPr>
+        <w:t xml:space="preserve">Laurea </w:t>
+      </w:r>
       <w:proofErr w:type="spellStart"/>
       <w:r>
         <w:rPr>
@@ -519,7 +507,7 @@
           <w:sz w:val="22"/>
           <w:szCs w:val="22"/>
         </w:rPr>
-        <w:t>Laurea</w:t>
+        <w:t>Specialistica</w:t>
       </w:r>
       <w:proofErr w:type="spellEnd"/>
       <w:r>
@@ -528,24 +516,6 @@
           <w:sz w:val="22"/>
           <w:szCs w:val="22"/>
         </w:rPr>
-        <w:t xml:space="preserve"> </w:t>
-      </w:r>
-      <w:proofErr w:type="spellStart"/>
-      <w:r>
-        <w:rPr>
-          <w:rFonts w:ascii="Arial" w:hAnsi="Arial" w:cs="Arial"/>
-          <w:sz w:val="22"/>
-          <w:szCs w:val="22"/>
-        </w:rPr>
-        <w:t>Specialistica</w:t>
-      </w:r>
-      <w:proofErr w:type="spellEnd"/>
-      <w:r>
-        <w:rPr>
-          <w:rFonts w:ascii="Arial" w:hAnsi="Arial" w:cs="Arial"/>
-          <w:sz w:val="22"/>
-          <w:szCs w:val="22"/>
-        </w:rPr>
         <w:t xml:space="preserve"> (M.S.) in Control Engineering (110/110 cum laude)</w:t>
       </w:r>
     </w:p>
@@ -605,25 +575,7 @@
           <w:sz w:val="22"/>
           <w:szCs w:val="22"/>
         </w:rPr>
-        <w:t xml:space="preserve">Dr. Davide </w:t>
-      </w:r>
-      <w:proofErr w:type="spellStart"/>
-      <w:r>
-        <w:rPr>
-          <w:rFonts w:ascii="Arial" w:hAnsi="Arial" w:cs="Arial"/>
-          <w:sz w:val="22"/>
-          <w:szCs w:val="22"/>
-        </w:rPr>
-        <w:t>Zoccolan</w:t>
-      </w:r>
-      <w:proofErr w:type="spellEnd"/>
-      <w:r>
-        <w:rPr>
-          <w:rFonts w:ascii="Arial" w:hAnsi="Arial" w:cs="Arial"/>
-          <w:sz w:val="22"/>
-          <w:szCs w:val="22"/>
-        </w:rPr>
-        <w:t>, Dr. James DiCarlo</w:t>
+        <w:t>Dr. Davide Zoccolan, Dr. James DiCarlo</w:t>
       </w:r>
     </w:p>
     <w:p>
@@ -728,20 +680,8 @@
           <w:sz w:val="22"/>
           <w:szCs w:val="22"/>
         </w:rPr>
-        <w:t xml:space="preserve"> Superiore </w:t>
-      </w:r>
-      <w:proofErr w:type="spellStart"/>
-      <w:r>
-        <w:rPr>
-          <w:rFonts w:ascii="Arial" w:hAnsi="Arial" w:cs="Arial"/>
-          <w:b/>
-          <w:bCs/>
-          <w:sz w:val="22"/>
-          <w:szCs w:val="22"/>
-        </w:rPr>
-        <w:t>Sant’Anna</w:t>
-      </w:r>
-      <w:proofErr w:type="spellEnd"/>
+        <w:t xml:space="preserve"> Superiore Sant’Anna</w:t>
+      </w:r>
       <w:r>
         <w:rPr>
           <w:rFonts w:ascii="Arial" w:hAnsi="Arial" w:cs="Arial"/>
@@ -1728,18 +1668,8 @@
           <w:sz w:val="22"/>
           <w:szCs w:val="22"/>
         </w:rPr>
-        <w:t xml:space="preserve"> Superiore </w:t>
-      </w:r>
-      <w:proofErr w:type="spellStart"/>
-      <w:r>
-        <w:rPr>
-          <w:rFonts w:ascii="Arial" w:hAnsi="Arial" w:cs="Arial"/>
-          <w:sz w:val="22"/>
-          <w:szCs w:val="22"/>
-        </w:rPr>
-        <w:t>Sant’Anna</w:t>
-      </w:r>
-      <w:proofErr w:type="spellEnd"/>
+        <w:t xml:space="preserve"> Superiore Sant’Anna</w:t>
+      </w:r>
     </w:p>
     <w:p>
       <w:pPr>
@@ -2434,8 +2364,8 @@
           <w:rFonts w:ascii="Arial" w:hAnsi="Arial" w:cs="Arial"/>
           <w:b/>
           <w:bCs/>
-          <w:sz w:val="16"/>
-          <w:szCs w:val="16"/>
+          <w:sz w:val="12"/>
+          <w:szCs w:val="12"/>
         </w:rPr>
       </w:pPr>
     </w:p>
@@ -2567,25 +2497,7 @@
           <w:sz w:val="22"/>
           <w:szCs w:val="22"/>
         </w:rPr>
-        <w:t>, C.*, Alemi-</w:t>
-      </w:r>
-      <w:proofErr w:type="spellStart"/>
-      <w:r>
-        <w:rPr>
-          <w:rFonts w:ascii="Arial" w:hAnsi="Arial" w:cs="Arial"/>
-          <w:sz w:val="22"/>
-          <w:szCs w:val="22"/>
-        </w:rPr>
-        <w:t>Neissi</w:t>
-      </w:r>
-      <w:proofErr w:type="spellEnd"/>
-      <w:r>
-        <w:rPr>
-          <w:rFonts w:ascii="Arial" w:hAnsi="Arial" w:cs="Arial"/>
-          <w:sz w:val="22"/>
-          <w:szCs w:val="22"/>
-        </w:rPr>
-        <w:t xml:space="preserve">, A.*, </w:t>
+        <w:t xml:space="preserve">, C.*, Alemi-Neissi, A.*, </w:t>
       </w:r>
       <w:r>
         <w:rPr>
@@ -2680,23 +2592,107 @@
           <w:sz w:val="22"/>
           <w:szCs w:val="22"/>
         </w:rPr>
-        <w:t xml:space="preserve"> Computational Biology</w:t>
-      </w:r>
-      <w:r>
-        <w:rPr>
-          <w:rFonts w:ascii="Arial" w:hAnsi="Arial" w:cs="Arial"/>
-          <w:sz w:val="22"/>
-          <w:szCs w:val="22"/>
-        </w:rPr>
-        <w:t>. 9 (8), e1003167 (PMCID3738466)</w:t>
-      </w:r>
-      <w:r>
-        <w:rPr>
-          <w:rFonts w:ascii="Arial" w:hAnsi="Arial" w:cs="Arial"/>
-          <w:sz w:val="22"/>
-          <w:szCs w:val="22"/>
-        </w:rPr>
-        <w:br/>
+        <w:t xml:space="preserve"> Computational</w:t>
+      </w:r>
+      <w:r>
+        <w:rPr>
+          <w:rFonts w:ascii="Arial" w:hAnsi="Arial" w:cs="Arial"/>
+          <w:i/>
+          <w:iCs/>
+          <w:sz w:val="22"/>
+          <w:szCs w:val="22"/>
+        </w:rPr>
+        <w:t xml:space="preserve"> </w:t>
+      </w:r>
+      <w:r>
+        <w:rPr>
+          <w:rFonts w:ascii="Arial" w:hAnsi="Arial" w:cs="Arial"/>
+          <w:i/>
+          <w:iCs/>
+          <w:sz w:val="22"/>
+          <w:szCs w:val="22"/>
+        </w:rPr>
+        <w:t>Biology</w:t>
+      </w:r>
+      <w:r>
+        <w:rPr>
+          <w:rFonts w:ascii="Arial" w:hAnsi="Arial" w:cs="Arial"/>
+          <w:sz w:val="22"/>
+          <w:szCs w:val="22"/>
+        </w:rPr>
+        <w:t>.</w:t>
+      </w:r>
+      <w:r>
+        <w:rPr>
+          <w:rFonts w:ascii="Arial" w:hAnsi="Arial" w:cs="Arial"/>
+          <w:sz w:val="22"/>
+          <w:szCs w:val="22"/>
+        </w:rPr>
+        <w:t xml:space="preserve"> </w:t>
+      </w:r>
+      <w:r>
+        <w:rPr>
+          <w:rFonts w:ascii="Arial" w:hAnsi="Arial" w:cs="Arial"/>
+          <w:sz w:val="22"/>
+          <w:szCs w:val="22"/>
+        </w:rPr>
+        <w:t>9</w:t>
+      </w:r>
+      <w:r>
+        <w:rPr>
+          <w:rFonts w:ascii="Arial" w:hAnsi="Arial" w:cs="Arial"/>
+          <w:sz w:val="22"/>
+          <w:szCs w:val="22"/>
+        </w:rPr>
+        <w:t xml:space="preserve"> </w:t>
+      </w:r>
+      <w:r>
+        <w:rPr>
+          <w:rFonts w:ascii="Arial" w:hAnsi="Arial" w:cs="Arial"/>
+          <w:sz w:val="22"/>
+          <w:szCs w:val="22"/>
+        </w:rPr>
+        <w:t>(8),</w:t>
+      </w:r>
+      <w:r>
+        <w:rPr>
+          <w:rFonts w:ascii="Arial" w:hAnsi="Arial" w:cs="Arial"/>
+          <w:sz w:val="22"/>
+          <w:szCs w:val="22"/>
+        </w:rPr>
+        <w:t xml:space="preserve"> </w:t>
+      </w:r>
+      <w:r>
+        <w:rPr>
+          <w:rFonts w:ascii="Arial" w:hAnsi="Arial" w:cs="Arial"/>
+          <w:sz w:val="22"/>
+          <w:szCs w:val="22"/>
+        </w:rPr>
+        <w:t>e1003167</w:t>
+      </w:r>
+      <w:r>
+        <w:rPr>
+          <w:rFonts w:ascii="Arial" w:hAnsi="Arial" w:cs="Arial"/>
+          <w:sz w:val="22"/>
+          <w:szCs w:val="22"/>
+        </w:rPr>
+        <w:tab/>
+      </w:r>
+      <w:r>
+        <w:rPr>
+          <w:rFonts w:ascii="Arial" w:hAnsi="Arial" w:cs="Arial"/>
+          <w:sz w:val="22"/>
+          <w:szCs w:val="22"/>
+        </w:rPr>
+        <w:tab/>
+      </w:r>
+      <w:r>
+        <w:rPr>
+          <w:rFonts w:ascii="Arial" w:hAnsi="Arial" w:cs="Arial"/>
+          <w:sz w:val="22"/>
+          <w:szCs w:val="22"/>
+        </w:rPr>
+        <w:tab/>
       </w:r>
       <w:r>
         <w:rPr>
@@ -2714,7 +2710,15 @@
           <w:sz w:val="22"/>
           <w:szCs w:val="22"/>
         </w:rPr>
-        <w:t xml:space="preserve">co-first author </w:t>
+        <w:t>co-fir</w:t>
+      </w:r>
+      <w:r>
+        <w:rPr>
+          <w:rFonts w:ascii="Arial" w:hAnsi="Arial" w:cs="Arial"/>
+          <w:sz w:val="22"/>
+          <w:szCs w:val="22"/>
+        </w:rPr>
+        <w:t>st author</w:t>
       </w:r>
     </w:p>
     <w:p>
@@ -2789,7 +2793,7 @@
           <w:sz w:val="22"/>
           <w:szCs w:val="22"/>
         </w:rPr>
-        <w:t xml:space="preserve">. 16 (8), 1132-1139 (PMCID3725208) </w:t>
+        <w:t xml:space="preserve">. 16 (8), 1132-1139 </w:t>
       </w:r>
     </w:p>
     <w:p>
@@ -2864,7 +2868,7 @@
           <w:sz w:val="22"/>
           <w:szCs w:val="22"/>
         </w:rPr>
-        <w:t xml:space="preserve">. 112 (6), 1584-1598 (PMCID4137243) </w:t>
+        <w:t xml:space="preserve">. 112 (6), 1584-1598 </w:t>
       </w:r>
     </w:p>
     <w:p>
@@ -2939,7 +2943,7 @@
           <w:sz w:val="22"/>
           <w:szCs w:val="22"/>
         </w:rPr>
-        <w:t xml:space="preserve">34 (33), 11067-11084 (PMCID4131017) </w:t>
+        <w:t xml:space="preserve">34 (33), 11067-11084 </w:t>
       </w:r>
     </w:p>
     <w:p>
@@ -2977,25 +2981,7 @@
           <w:sz w:val="22"/>
           <w:szCs w:val="22"/>
         </w:rPr>
-        <w:t xml:space="preserve">, </w:t>
-      </w:r>
-      <w:proofErr w:type="spellStart"/>
-      <w:r>
-        <w:rPr>
-          <w:rFonts w:ascii="Arial" w:hAnsi="Arial" w:cs="Arial"/>
-          <w:sz w:val="22"/>
-          <w:szCs w:val="22"/>
-        </w:rPr>
-        <w:t>Simoncelli</w:t>
-      </w:r>
-      <w:proofErr w:type="spellEnd"/>
-      <w:r>
-        <w:rPr>
-          <w:rFonts w:ascii="Arial" w:hAnsi="Arial" w:cs="Arial"/>
-          <w:sz w:val="22"/>
-          <w:szCs w:val="22"/>
-        </w:rPr>
-        <w:t xml:space="preserve"> E.P., Rust N.C. (2016). </w:t>
+        <w:t xml:space="preserve">, Simoncelli E.P., Rust N.C. (2016). </w:t>
       </w:r>
       <w:hyperlink r:id="rId13" w:history="1">
         <w:r>
@@ -3032,7 +3018,7 @@
           <w:sz w:val="22"/>
           <w:szCs w:val="22"/>
         </w:rPr>
-        <w:t xml:space="preserve">28 (11), 2291-2319 (PMCID6395528) </w:t>
+        <w:t xml:space="preserve">28 (11), 2291-2319 </w:t>
       </w:r>
     </w:p>
     <w:p>
@@ -3078,25 +3064,7 @@
           <w:sz w:val="22"/>
           <w:szCs w:val="22"/>
         </w:rPr>
-        <w:t xml:space="preserve">, Piet, A.T.*, Kopec, C.D., </w:t>
-      </w:r>
-      <w:proofErr w:type="spellStart"/>
-      <w:r>
-        <w:rPr>
-          <w:rFonts w:ascii="Arial" w:hAnsi="Arial" w:cs="Arial"/>
-          <w:sz w:val="22"/>
-          <w:szCs w:val="22"/>
-        </w:rPr>
-        <w:t>Akrami</w:t>
-      </w:r>
-      <w:proofErr w:type="spellEnd"/>
-      <w:r>
-        <w:rPr>
-          <w:rFonts w:ascii="Arial" w:hAnsi="Arial" w:cs="Arial"/>
-          <w:sz w:val="22"/>
-          <w:szCs w:val="22"/>
-        </w:rPr>
-        <w:t xml:space="preserve">, A., Riordan, A.J., Erlich, J.C., Brody, C.D. (2021) </w:t>
+        <w:t xml:space="preserve">, Piet, A.T.*, Kopec, C.D., Akrami, A., Riordan, A.J., Erlich, J.C., Brody, C.D. (2021) </w:t>
       </w:r>
       <w:hyperlink r:id="rId14" w:history="1">
         <w:proofErr w:type="spellStart"/>
@@ -3186,59 +3154,15 @@
           <w:sz w:val="22"/>
           <w:szCs w:val="22"/>
         </w:rPr>
-        <w:t xml:space="preserve"> (PM</w:t>
-      </w:r>
-      <w:r>
-        <w:rPr>
-          <w:rFonts w:ascii="Arial" w:hAnsi="Arial" w:cs="Arial"/>
-          <w:sz w:val="22"/>
-          <w:szCs w:val="22"/>
-        </w:rPr>
-        <w:t>C</w:t>
-      </w:r>
-      <w:r>
-        <w:rPr>
-          <w:rFonts w:ascii="Arial" w:hAnsi="Arial" w:cs="Arial"/>
-          <w:sz w:val="22"/>
-          <w:szCs w:val="22"/>
-        </w:rPr>
-        <w:t>ID</w:t>
-      </w:r>
-      <w:r>
-        <w:rPr>
-          <w:rFonts w:ascii="Arial" w:hAnsi="Arial" w:cs="Arial"/>
-          <w:sz w:val="22"/>
-          <w:szCs w:val="22"/>
-        </w:rPr>
-        <w:t>34083787</w:t>
-      </w:r>
-      <w:r>
-        <w:rPr>
-          <w:rFonts w:ascii="Arial" w:hAnsi="Arial" w:cs="Arial"/>
-          <w:sz w:val="22"/>
-          <w:szCs w:val="22"/>
-        </w:rPr>
-        <w:t>)</w:t>
-      </w:r>
-    </w:p>
-    <w:p>
-      <w:pPr>
-        <w:jc w:val="both"/>
-        <w:rPr>
-          <w:rFonts w:ascii="Arial" w:hAnsi="Arial" w:cs="Arial"/>
-          <w:sz w:val="22"/>
-          <w:szCs w:val="22"/>
-        </w:rPr>
-      </w:pPr>
-      <w:r>
-        <w:rPr>
-          <w:rFonts w:ascii="Arial" w:hAnsi="Arial" w:cs="Arial"/>
-          <w:i/>
-          <w:iCs/>
-          <w:sz w:val="22"/>
-          <w:szCs w:val="22"/>
-        </w:rPr>
         <w:t xml:space="preserve"> </w:t>
+      </w:r>
+      <w:r>
+        <w:rPr>
+          <w:rFonts w:ascii="Arial" w:hAnsi="Arial" w:cs="Arial"/>
+          <w:sz w:val="22"/>
+          <w:szCs w:val="22"/>
+        </w:rPr>
+        <w:tab/>
       </w:r>
       <w:r>
         <w:rPr>
@@ -3275,16 +3199,14 @@
         <w:jc w:val="both"/>
         <w:rPr>
           <w:rFonts w:ascii="Arial" w:hAnsi="Arial" w:cs="Arial"/>
+          <w:sz w:val="22"/>
+          <w:szCs w:val="22"/>
+        </w:rPr>
+      </w:pPr>
+      <w:r>
+        <w:rPr>
+          <w:rFonts w:ascii="Arial" w:hAnsi="Arial" w:cs="Arial"/>
           <w:b/>
-          <w:bCs/>
-          <w:sz w:val="22"/>
-          <w:szCs w:val="22"/>
-        </w:rPr>
-      </w:pPr>
-      <w:r>
-        <w:rPr>
-          <w:rFonts w:ascii="Arial" w:hAnsi="Arial" w:cs="Arial"/>
-          <w:b/>
           <w:sz w:val="22"/>
           <w:szCs w:val="22"/>
         </w:rPr>
@@ -3314,23 +3236,13 @@
         </w:rPr>
         <w:t xml:space="preserve">., </w:t>
       </w:r>
-      <w:proofErr w:type="spellStart"/>
-      <w:r>
-        <w:rPr>
-          <w:rFonts w:ascii="Arial" w:hAnsi="Arial" w:cs="Arial"/>
-          <w:sz w:val="22"/>
-          <w:szCs w:val="22"/>
-        </w:rPr>
-        <w:t>Ostojic</w:t>
-      </w:r>
-      <w:proofErr w:type="spellEnd"/>
-      <w:r>
-        <w:rPr>
-          <w:rFonts w:ascii="Arial" w:hAnsi="Arial" w:cs="Arial"/>
-          <w:sz w:val="22"/>
-          <w:szCs w:val="22"/>
-        </w:rPr>
-        <w:t>, S.</w:t>
+      <w:r>
+        <w:rPr>
+          <w:rFonts w:ascii="Arial" w:hAnsi="Arial" w:cs="Arial"/>
+          <w:sz w:val="22"/>
+          <w:szCs w:val="22"/>
+        </w:rPr>
+        <w:t>Ostojic, S.</w:t>
       </w:r>
       <w:r>
         <w:rPr>
@@ -3402,57 +3314,45 @@
         <w:jc w:val="both"/>
         <w:rPr>
           <w:rFonts w:ascii="Arial" w:hAnsi="Arial" w:cs="Arial"/>
-          <w:b/>
-          <w:bCs/>
           <w:sz w:val="16"/>
           <w:szCs w:val="16"/>
-        </w:rPr>
-      </w:pPr>
-    </w:p>
-    <w:p>
-      <w:pPr>
-        <w:jc w:val="both"/>
-        <w:rPr>
-          <w:rFonts w:ascii="Arial" w:hAnsi="Arial" w:cs="Arial"/>
-          <w:sz w:val="22"/>
-          <w:szCs w:val="22"/>
           <w:lang w:val="en-GB"/>
         </w:rPr>
       </w:pPr>
-      <w:r>
-        <w:rPr>
-          <w:rFonts w:ascii="Arial" w:hAnsi="Arial" w:cs="Arial"/>
-          <w:b/>
-          <w:sz w:val="22"/>
-          <w:szCs w:val="22"/>
-        </w:rPr>
-        <w:t>Pagan, M.</w:t>
-      </w:r>
-      <w:r>
-        <w:rPr>
-          <w:rFonts w:ascii="Arial" w:hAnsi="Arial" w:cs="Arial"/>
-          <w:sz w:val="22"/>
-          <w:szCs w:val="22"/>
-        </w:rPr>
-        <w:t xml:space="preserve">, Tang, V., Aoi, M.C., Pillow, J.W., Mante, V., </w:t>
-      </w:r>
-      <w:proofErr w:type="spellStart"/>
-      <w:r>
-        <w:rPr>
-          <w:rFonts w:ascii="Arial" w:hAnsi="Arial" w:cs="Arial"/>
-          <w:sz w:val="22"/>
-          <w:szCs w:val="22"/>
-        </w:rPr>
-        <w:t>Sussillo</w:t>
-      </w:r>
-      <w:proofErr w:type="spellEnd"/>
-      <w:r>
-        <w:rPr>
-          <w:rFonts w:ascii="Arial" w:hAnsi="Arial" w:cs="Arial"/>
-          <w:sz w:val="22"/>
-          <w:szCs w:val="22"/>
-        </w:rPr>
-        <w:t>, D.</w:t>
+    </w:p>
+    <w:p>
+      <w:pPr>
+        <w:jc w:val="both"/>
+        <w:rPr>
+          <w:rFonts w:ascii="Arial" w:hAnsi="Arial" w:cs="Arial"/>
+          <w:sz w:val="22"/>
+          <w:szCs w:val="22"/>
+          <w:lang w:val="en-GB"/>
+        </w:rPr>
+      </w:pPr>
+      <w:r>
+        <w:rPr>
+          <w:rFonts w:ascii="Arial" w:hAnsi="Arial" w:cs="Arial"/>
+          <w:sz w:val="22"/>
+          <w:szCs w:val="22"/>
+        </w:rPr>
+        <w:t>Pagan, M., Tang, V.D., Aoi, M.C.</w:t>
+      </w:r>
+      <w:r>
+        <w:rPr>
+          <w:rFonts w:ascii="Arial" w:hAnsi="Arial" w:cs="Arial"/>
+          <w:sz w:val="22"/>
+          <w:szCs w:val="22"/>
+        </w:rPr>
+        <w:t xml:space="preserve">, </w:t>
+      </w:r>
+      <w:r>
+        <w:rPr>
+          <w:rFonts w:ascii="Arial" w:hAnsi="Arial" w:cs="Arial"/>
+          <w:sz w:val="22"/>
+          <w:szCs w:val="22"/>
+        </w:rPr>
+        <w:t>Pillow, J.W., Mante, V., Sussillo, D.</w:t>
       </w:r>
       <w:r>
         <w:rPr>
@@ -3476,23 +3376,7 @@
           <w:sz w:val="22"/>
           <w:szCs w:val="22"/>
         </w:rPr>
-        <w:t xml:space="preserve"> (202</w:t>
-      </w:r>
-      <w:r>
-        <w:rPr>
-          <w:rFonts w:ascii="Arial" w:hAnsi="Arial" w:cs="Arial"/>
-          <w:sz w:val="22"/>
-          <w:szCs w:val="22"/>
-        </w:rPr>
-        <w:t>4</w:t>
-      </w:r>
-      <w:r>
-        <w:rPr>
-          <w:rFonts w:ascii="Arial" w:hAnsi="Arial" w:cs="Arial"/>
-          <w:sz w:val="22"/>
-          <w:szCs w:val="22"/>
-        </w:rPr>
-        <w:t>)</w:t>
+        <w:t xml:space="preserve"> (2025)</w:t>
       </w:r>
       <w:r>
         <w:rPr>
@@ -3519,7 +3403,7 @@
           <w:sz w:val="22"/>
           <w:szCs w:val="22"/>
         </w:rPr>
-        <w:t xml:space="preserve">, </w:t>
+        <w:t>. </w:t>
       </w:r>
       <w:r>
         <w:rPr>
@@ -3528,7 +3412,6 @@
           <w:iCs/>
           <w:sz w:val="22"/>
           <w:szCs w:val="22"/>
-          <w:lang w:val="en-GB"/>
         </w:rPr>
         <w:t>Nature</w:t>
       </w:r>
@@ -3537,26 +3420,26 @@
           <w:rFonts w:ascii="Arial" w:hAnsi="Arial" w:cs="Arial"/>
           <w:sz w:val="22"/>
           <w:szCs w:val="22"/>
-          <w:lang w:val="en-GB"/>
-        </w:rPr>
-        <w:t xml:space="preserve">. </w:t>
-      </w:r>
-      <w:r>
-        <w:rPr>
-          <w:rFonts w:ascii="Arial" w:hAnsi="Arial" w:cs="Arial"/>
-          <w:sz w:val="22"/>
-          <w:szCs w:val="22"/>
-        </w:rPr>
-        <w:t>https://doi.org/10.1038/s41586-024-08433-6</w:t>
-      </w:r>
-      <w:r>
-        <w:rPr>
-          <w:rFonts w:ascii="Arial" w:hAnsi="Arial" w:cs="Arial"/>
-          <w:sz w:val="22"/>
-          <w:szCs w:val="22"/>
-          <w:lang w:val="en-GB"/>
-        </w:rPr>
-        <w:t xml:space="preserve"> </w:t>
+        </w:rPr>
+        <w:t> </w:t>
+      </w:r>
+      <w:r>
+        <w:rPr>
+          <w:rFonts w:ascii="Arial" w:hAnsi="Arial" w:cs="Arial"/>
+          <w:b/>
+          <w:bCs/>
+          <w:sz w:val="22"/>
+          <w:szCs w:val="22"/>
+        </w:rPr>
+        <w:t>639</w:t>
+      </w:r>
+      <w:r>
+        <w:rPr>
+          <w:rFonts w:ascii="Arial" w:hAnsi="Arial" w:cs="Arial"/>
+          <w:sz w:val="22"/>
+          <w:szCs w:val="22"/>
+        </w:rPr>
+        <w:t xml:space="preserve">, 421–429. </w:t>
       </w:r>
     </w:p>
     <w:p>
@@ -3618,8 +3501,8 @@
         <w:rPr>
           <w:rFonts w:ascii="Arial" w:hAnsi="Arial" w:cs="Arial"/>
           <w:bCs/>
-          <w:sz w:val="16"/>
-          <w:szCs w:val="16"/>
+          <w:sz w:val="12"/>
+          <w:szCs w:val="12"/>
         </w:rPr>
       </w:pPr>
     </w:p>
@@ -4026,7 +3909,7 @@
           <w:sz w:val="22"/>
           <w:szCs w:val="22"/>
         </w:rPr>
-        <w:t xml:space="preserve"> (invited talk)</w:t>
+        <w:t xml:space="preserve"> </w:t>
       </w:r>
     </w:p>
     <w:p>
@@ -4250,7 +4133,7 @@
           <w:sz w:val="22"/>
           <w:szCs w:val="22"/>
         </w:rPr>
-        <w:t xml:space="preserve"> (invited talk)</w:t>
+        <w:t xml:space="preserve"> </w:t>
       </w:r>
     </w:p>
     <w:p>
@@ -4421,7 +4304,7 @@
           <w:sz w:val="22"/>
           <w:szCs w:val="22"/>
         </w:rPr>
-        <w:t xml:space="preserve"> (invited talk)</w:t>
+        <w:t xml:space="preserve"> </w:t>
       </w:r>
     </w:p>
     <w:p>
@@ -4886,6 +4769,7 @@
         <w:jc w:val="both"/>
         <w:rPr>
           <w:rFonts w:ascii="Arial" w:hAnsi="Arial" w:cs="Arial"/>
+          <w:b/>
           <w:bCs/>
           <w:sz w:val="22"/>
           <w:szCs w:val="22"/>
@@ -4999,7 +4883,7 @@
           <w:sz w:val="22"/>
           <w:szCs w:val="22"/>
         </w:rPr>
-        <w:t xml:space="preserve"> (invited talk)</w:t>
+        <w:t xml:space="preserve"> </w:t>
       </w:r>
     </w:p>
     <w:p>
@@ -5010,6 +4894,8 @@
           <w:rFonts w:ascii="Arial" w:hAnsi="Arial" w:cs="Arial"/>
           <w:b/>
           <w:bCs/>
+          <w:i/>
+          <w:iCs/>
           <w:sz w:val="22"/>
           <w:szCs w:val="22"/>
         </w:rPr>
@@ -5031,8 +4917,475 @@
           <w:szCs w:val="22"/>
         </w:rPr>
         <w:tab/>
-        <w:t>Neural sources of individual variability in cognitive behavior, SIDB Annual Research Retreat</w:t>
-      </w:r>
+        <w:t xml:space="preserve">Neural sources of individual variability in cognitive behavior, </w:t>
+      </w:r>
+      <w:r>
+        <w:rPr>
+          <w:rFonts w:ascii="Arial" w:hAnsi="Arial" w:cs="Arial"/>
+          <w:bCs/>
+          <w:i/>
+          <w:iCs/>
+          <w:sz w:val="22"/>
+          <w:szCs w:val="22"/>
+        </w:rPr>
+        <w:t xml:space="preserve">Sainsbury </w:t>
+      </w:r>
+      <w:proofErr w:type="spellStart"/>
+      <w:r>
+        <w:rPr>
+          <w:rFonts w:ascii="Arial" w:hAnsi="Arial" w:cs="Arial"/>
+          <w:bCs/>
+          <w:i/>
+          <w:iCs/>
+          <w:sz w:val="22"/>
+          <w:szCs w:val="22"/>
+        </w:rPr>
+        <w:t>Wellcome</w:t>
+      </w:r>
+      <w:proofErr w:type="spellEnd"/>
+      <w:r>
+        <w:rPr>
+          <w:rFonts w:ascii="Arial" w:hAnsi="Arial" w:cs="Arial"/>
+          <w:bCs/>
+          <w:i/>
+          <w:iCs/>
+          <w:sz w:val="22"/>
+          <w:szCs w:val="22"/>
+        </w:rPr>
+        <w:t xml:space="preserve"> </w:t>
+      </w:r>
+      <w:r>
+        <w:rPr>
+          <w:rFonts w:ascii="Arial" w:hAnsi="Arial" w:cs="Arial"/>
+          <w:bCs/>
+          <w:i/>
+          <w:iCs/>
+          <w:sz w:val="22"/>
+          <w:szCs w:val="22"/>
+        </w:rPr>
+        <w:t>Centre</w:t>
+      </w:r>
+      <w:r>
+        <w:rPr>
+          <w:rFonts w:ascii="Arial" w:hAnsi="Arial" w:cs="Arial"/>
+          <w:bCs/>
+          <w:i/>
+          <w:iCs/>
+          <w:sz w:val="22"/>
+          <w:szCs w:val="22"/>
+        </w:rPr>
+        <w:t xml:space="preserve"> Seminar</w:t>
+      </w:r>
+    </w:p>
+    <w:p>
+      <w:pPr>
+        <w:ind w:left="720" w:hanging="720"/>
+        <w:jc w:val="both"/>
+        <w:rPr>
+          <w:rFonts w:ascii="Arial" w:hAnsi="Arial" w:cs="Arial"/>
+          <w:sz w:val="22"/>
+          <w:szCs w:val="22"/>
+          <w:lang w:val="en-GB"/>
+        </w:rPr>
+      </w:pPr>
+      <w:r>
+        <w:rPr>
+          <w:rFonts w:ascii="Arial" w:hAnsi="Arial" w:cs="Arial"/>
+          <w:bCs/>
+          <w:sz w:val="22"/>
+          <w:szCs w:val="22"/>
+        </w:rPr>
+        <w:t>2023</w:t>
+      </w:r>
+      <w:r>
+        <w:rPr>
+          <w:rFonts w:ascii="Arial" w:hAnsi="Arial" w:cs="Arial"/>
+          <w:bCs/>
+          <w:sz w:val="22"/>
+          <w:szCs w:val="22"/>
+        </w:rPr>
+        <w:tab/>
+      </w:r>
+      <w:r>
+        <w:rPr>
+          <w:rFonts w:ascii="Arial" w:hAnsi="Arial" w:cs="Arial"/>
+          <w:sz w:val="22"/>
+          <w:szCs w:val="22"/>
+          <w:lang w:val="en-GB"/>
+        </w:rPr>
+        <w:t>Probing flexible decision-making</w:t>
+      </w:r>
+      <w:r>
+        <w:rPr>
+          <w:rFonts w:ascii="Arial" w:hAnsi="Arial" w:cs="Arial"/>
+          <w:sz w:val="22"/>
+          <w:szCs w:val="22"/>
+          <w:lang w:val="en-GB"/>
+        </w:rPr>
+        <w:t xml:space="preserve"> </w:t>
+      </w:r>
+      <w:r>
+        <w:rPr>
+          <w:rFonts w:ascii="Arial" w:hAnsi="Arial" w:cs="Arial"/>
+          <w:sz w:val="22"/>
+          <w:szCs w:val="22"/>
+          <w:lang w:val="en-GB"/>
+        </w:rPr>
+        <w:t>in rat models of autism</w:t>
+      </w:r>
+      <w:r>
+        <w:rPr>
+          <w:rFonts w:ascii="Arial" w:hAnsi="Arial" w:cs="Arial"/>
+          <w:bCs/>
+          <w:sz w:val="22"/>
+          <w:szCs w:val="22"/>
+        </w:rPr>
+        <w:t xml:space="preserve">, </w:t>
+      </w:r>
+      <w:r>
+        <w:rPr>
+          <w:rFonts w:ascii="Arial" w:hAnsi="Arial" w:cs="Arial"/>
+          <w:bCs/>
+          <w:i/>
+          <w:iCs/>
+          <w:sz w:val="22"/>
+          <w:szCs w:val="22"/>
+        </w:rPr>
+        <w:t>SFARI Autism Rat Consortium Meeting</w:t>
+      </w:r>
+    </w:p>
+    <w:p>
+      <w:pPr>
+        <w:ind w:left="720" w:hanging="720"/>
+        <w:jc w:val="both"/>
+        <w:rPr>
+          <w:rFonts w:ascii="Arial" w:hAnsi="Arial" w:cs="Arial"/>
+          <w:b/>
+          <w:bCs/>
+          <w:sz w:val="22"/>
+          <w:szCs w:val="22"/>
+        </w:rPr>
+      </w:pPr>
+      <w:r>
+        <w:rPr>
+          <w:rFonts w:ascii="Arial" w:hAnsi="Arial" w:cs="Arial"/>
+          <w:bCs/>
+          <w:sz w:val="22"/>
+          <w:szCs w:val="22"/>
+        </w:rPr>
+        <w:t>2024</w:t>
+      </w:r>
+      <w:r>
+        <w:rPr>
+          <w:rFonts w:ascii="Arial" w:hAnsi="Arial" w:cs="Arial"/>
+          <w:bCs/>
+          <w:sz w:val="22"/>
+          <w:szCs w:val="22"/>
+        </w:rPr>
+        <w:tab/>
+      </w:r>
+      <w:r>
+        <w:rPr>
+          <w:rFonts w:ascii="Arial" w:hAnsi="Arial" w:cs="Arial"/>
+          <w:bCs/>
+          <w:sz w:val="22"/>
+          <w:szCs w:val="22"/>
+          <w:lang w:val="en-GB"/>
+        </w:rPr>
+        <w:t>Harnessing individual variability in rat models of autism</w:t>
+      </w:r>
+      <w:r>
+        <w:rPr>
+          <w:rFonts w:ascii="Arial" w:hAnsi="Arial" w:cs="Arial"/>
+          <w:bCs/>
+          <w:sz w:val="22"/>
+          <w:szCs w:val="22"/>
+        </w:rPr>
+        <w:t xml:space="preserve">, </w:t>
+      </w:r>
+      <w:r>
+        <w:rPr>
+          <w:rFonts w:ascii="Arial" w:hAnsi="Arial" w:cs="Arial"/>
+          <w:bCs/>
+          <w:i/>
+          <w:iCs/>
+          <w:sz w:val="22"/>
+          <w:szCs w:val="22"/>
+        </w:rPr>
+        <w:t>SFARI Autism Rat Consortium Meeting</w:t>
+      </w:r>
+    </w:p>
+    <w:p>
+      <w:pPr>
+        <w:ind w:left="720" w:hanging="720"/>
+        <w:jc w:val="both"/>
+        <w:rPr>
+          <w:rFonts w:ascii="Arial" w:hAnsi="Arial" w:cs="Arial"/>
+          <w:bCs/>
+          <w:sz w:val="22"/>
+          <w:szCs w:val="22"/>
+          <w:lang w:val="en-GB"/>
+        </w:rPr>
+      </w:pPr>
+      <w:r>
+        <w:rPr>
+          <w:rFonts w:ascii="Arial" w:hAnsi="Arial" w:cs="Arial"/>
+          <w:bCs/>
+          <w:sz w:val="22"/>
+          <w:szCs w:val="22"/>
+        </w:rPr>
+        <w:t>202</w:t>
+      </w:r>
+      <w:r>
+        <w:rPr>
+          <w:rFonts w:ascii="Arial" w:hAnsi="Arial" w:cs="Arial"/>
+          <w:bCs/>
+          <w:sz w:val="22"/>
+          <w:szCs w:val="22"/>
+        </w:rPr>
+        <w:t>5</w:t>
+      </w:r>
+      <w:r>
+        <w:rPr>
+          <w:rFonts w:ascii="Arial" w:hAnsi="Arial" w:cs="Arial"/>
+          <w:bCs/>
+          <w:sz w:val="22"/>
+          <w:szCs w:val="22"/>
+        </w:rPr>
+        <w:tab/>
+      </w:r>
+      <w:r>
+        <w:rPr>
+          <w:rFonts w:ascii="Arial" w:hAnsi="Arial" w:cs="Arial"/>
+          <w:bCs/>
+          <w:sz w:val="22"/>
+          <w:szCs w:val="22"/>
+          <w:lang w:val="en-GB"/>
+        </w:rPr>
+        <w:t>Learning flexible decision-making in rats and recurrent neural networks</w:t>
+      </w:r>
+      <w:r>
+        <w:rPr>
+          <w:rFonts w:ascii="Arial" w:hAnsi="Arial" w:cs="Arial"/>
+          <w:bCs/>
+          <w:sz w:val="22"/>
+          <w:szCs w:val="22"/>
+        </w:rPr>
+        <w:t xml:space="preserve">, </w:t>
+      </w:r>
+      <w:proofErr w:type="spellStart"/>
+      <w:r>
+        <w:rPr>
+          <w:rFonts w:ascii="Arial" w:hAnsi="Arial" w:cs="Arial"/>
+          <w:i/>
+          <w:sz w:val="22"/>
+          <w:szCs w:val="22"/>
+        </w:rPr>
+        <w:t>CoSyNe</w:t>
+      </w:r>
+      <w:proofErr w:type="spellEnd"/>
+    </w:p>
+    <w:p>
+      <w:pPr>
+        <w:ind w:left="720" w:hanging="720"/>
+        <w:jc w:val="both"/>
+        <w:rPr>
+          <w:rFonts w:ascii="Arial" w:hAnsi="Arial" w:cs="Arial"/>
+          <w:b/>
+          <w:bCs/>
+          <w:sz w:val="22"/>
+          <w:szCs w:val="22"/>
+        </w:rPr>
+      </w:pPr>
+      <w:r>
+        <w:rPr>
+          <w:rFonts w:ascii="Arial" w:hAnsi="Arial" w:cs="Arial"/>
+          <w:bCs/>
+          <w:sz w:val="22"/>
+          <w:szCs w:val="22"/>
+        </w:rPr>
+        <w:t>202</w:t>
+      </w:r>
+      <w:r>
+        <w:rPr>
+          <w:rFonts w:ascii="Arial" w:hAnsi="Arial" w:cs="Arial"/>
+          <w:bCs/>
+          <w:sz w:val="22"/>
+          <w:szCs w:val="22"/>
+        </w:rPr>
+        <w:t>5</w:t>
+      </w:r>
+      <w:r>
+        <w:rPr>
+          <w:rFonts w:ascii="Arial" w:hAnsi="Arial" w:cs="Arial"/>
+          <w:bCs/>
+          <w:sz w:val="22"/>
+          <w:szCs w:val="22"/>
+        </w:rPr>
+        <w:tab/>
+      </w:r>
+      <w:r>
+        <w:rPr>
+          <w:rFonts w:ascii="Arial" w:hAnsi="Arial" w:cs="Arial"/>
+          <w:bCs/>
+          <w:sz w:val="22"/>
+          <w:szCs w:val="22"/>
+          <w:lang w:val="en-GB"/>
+        </w:rPr>
+        <w:t>Neural mechanisms underlying flexible decision-making in rat models of autism</w:t>
+      </w:r>
+      <w:r>
+        <w:rPr>
+          <w:rFonts w:ascii="Arial" w:hAnsi="Arial" w:cs="Arial"/>
+          <w:bCs/>
+          <w:sz w:val="22"/>
+          <w:szCs w:val="22"/>
+        </w:rPr>
+        <w:t xml:space="preserve">, </w:t>
+      </w:r>
+      <w:r>
+        <w:rPr>
+          <w:rFonts w:ascii="Arial" w:hAnsi="Arial" w:cs="Arial"/>
+          <w:bCs/>
+          <w:i/>
+          <w:iCs/>
+          <w:sz w:val="22"/>
+          <w:szCs w:val="22"/>
+        </w:rPr>
+        <w:t>SFARI Annual Meeting</w:t>
+      </w:r>
+    </w:p>
+    <w:p>
+      <w:pPr>
+        <w:ind w:left="720" w:hanging="720"/>
+        <w:jc w:val="both"/>
+        <w:rPr>
+          <w:rFonts w:ascii="Arial" w:hAnsi="Arial" w:cs="Arial"/>
+          <w:bCs/>
+          <w:sz w:val="22"/>
+          <w:szCs w:val="22"/>
+          <w:lang w:val="en-GB"/>
+        </w:rPr>
+      </w:pPr>
+      <w:r>
+        <w:rPr>
+          <w:rFonts w:ascii="Arial" w:hAnsi="Arial" w:cs="Arial"/>
+          <w:bCs/>
+          <w:sz w:val="22"/>
+          <w:szCs w:val="22"/>
+        </w:rPr>
+        <w:t>202</w:t>
+      </w:r>
+      <w:r>
+        <w:rPr>
+          <w:rFonts w:ascii="Arial" w:hAnsi="Arial" w:cs="Arial"/>
+          <w:bCs/>
+          <w:sz w:val="22"/>
+          <w:szCs w:val="22"/>
+        </w:rPr>
+        <w:t>6</w:t>
+      </w:r>
+      <w:r>
+        <w:rPr>
+          <w:rFonts w:ascii="Arial" w:hAnsi="Arial" w:cs="Arial"/>
+          <w:bCs/>
+          <w:sz w:val="22"/>
+          <w:szCs w:val="22"/>
+        </w:rPr>
+        <w:tab/>
+      </w:r>
+      <w:r>
+        <w:rPr>
+          <w:rFonts w:ascii="Arial" w:hAnsi="Arial" w:cs="Arial"/>
+          <w:sz w:val="22"/>
+          <w:szCs w:val="22"/>
+          <w:lang w:val="en-GB"/>
+        </w:rPr>
+        <w:t xml:space="preserve">Enhanced prefrontal loss sensitivity in excessively submissive </w:t>
+      </w:r>
+      <w:r>
+        <w:rPr>
+          <w:rFonts w:ascii="Arial" w:hAnsi="Arial" w:cs="Arial"/>
+          <w:sz w:val="22"/>
+          <w:szCs w:val="22"/>
+          <w:lang w:val="en-GB"/>
+        </w:rPr>
+        <w:t>F</w:t>
+      </w:r>
+      <w:r>
+        <w:rPr>
+          <w:rFonts w:ascii="Arial" w:hAnsi="Arial" w:cs="Arial"/>
+          <w:sz w:val="22"/>
+          <w:szCs w:val="22"/>
+          <w:lang w:val="en-GB"/>
+        </w:rPr>
+        <w:t xml:space="preserve">ragile </w:t>
+      </w:r>
+      <w:r>
+        <w:rPr>
+          <w:rFonts w:ascii="Arial" w:hAnsi="Arial" w:cs="Arial"/>
+          <w:sz w:val="22"/>
+          <w:szCs w:val="22"/>
+          <w:lang w:val="en-GB"/>
+        </w:rPr>
+        <w:t>X</w:t>
+      </w:r>
+      <w:r>
+        <w:rPr>
+          <w:rFonts w:ascii="Arial" w:hAnsi="Arial" w:cs="Arial"/>
+          <w:sz w:val="22"/>
+          <w:szCs w:val="22"/>
+          <w:lang w:val="en-GB"/>
+        </w:rPr>
+        <w:t xml:space="preserve"> </w:t>
+      </w:r>
+      <w:r>
+        <w:rPr>
+          <w:rFonts w:ascii="Arial" w:hAnsi="Arial" w:cs="Arial"/>
+          <w:sz w:val="22"/>
+          <w:szCs w:val="22"/>
+          <w:lang w:val="en-GB"/>
+        </w:rPr>
+        <w:t>S</w:t>
+      </w:r>
+      <w:r>
+        <w:rPr>
+          <w:rFonts w:ascii="Arial" w:hAnsi="Arial" w:cs="Arial"/>
+          <w:sz w:val="22"/>
+          <w:szCs w:val="22"/>
+          <w:lang w:val="en-GB"/>
+        </w:rPr>
+        <w:t>yndrome</w:t>
+      </w:r>
+      <w:r>
+        <w:rPr>
+          <w:rFonts w:ascii="Arial" w:hAnsi="Arial" w:cs="Arial"/>
+          <w:sz w:val="22"/>
+          <w:szCs w:val="22"/>
+          <w:lang w:val="en-GB"/>
+        </w:rPr>
+        <w:t xml:space="preserve"> model rats</w:t>
+      </w:r>
+      <w:r>
+        <w:rPr>
+          <w:rFonts w:ascii="Arial" w:hAnsi="Arial" w:cs="Arial"/>
+          <w:bCs/>
+          <w:sz w:val="22"/>
+          <w:szCs w:val="22"/>
+        </w:rPr>
+        <w:t xml:space="preserve">, </w:t>
+      </w:r>
+      <w:proofErr w:type="spellStart"/>
+      <w:r>
+        <w:rPr>
+          <w:rFonts w:ascii="Arial" w:hAnsi="Arial" w:cs="Arial"/>
+          <w:i/>
+          <w:sz w:val="22"/>
+          <w:szCs w:val="22"/>
+        </w:rPr>
+        <w:t>CoSyNe</w:t>
+      </w:r>
+      <w:proofErr w:type="spellEnd"/>
     </w:p>
     <w:sectPr>
       <w:headerReference w:type="default" r:id="rId17"/>
@@ -5048,7 +5401,7 @@
 </file>
 
 <file path=word/endnotes.xml><?xml version="1.0" encoding="utf-8"?>
-<w:endnotes xmlns:wpc="http://schemas.microsoft.com/office/word/2010/wordprocessingCanvas" xmlns:cx="http://schemas.microsoft.com/office/drawing/2014/chartex" xmlns:cx1="http://schemas.microsoft.com/office/drawing/2015/9/8/chartex" xmlns:cx2="http://schemas.microsoft.com/office/drawing/2015/10/21/chartex" xmlns:cx3="http://schemas.microsoft.com/office/drawing/2016/5/9/chartex" xmlns:cx4="http://schemas.microsoft.com/office/drawing/2016/5/10/chartex" xmlns:cx5="http://schemas.microsoft.com/office/drawing/2016/5/11/chartex" xmlns:cx6="http://schemas.microsoft.com/office/drawing/2016/5/12/chartex" xmlns:cx7="http://schemas.microsoft.com/office/drawing/2016/5/13/chartex" xmlns:cx8="http://schemas.microsoft.com/office/drawing/2016/5/14/chartex" xmlns:mc="http://schemas.openxmlformats.org/markup-compatibility/2006" xmlns:aink="http://schemas.microsoft.com/office/drawing/2016/ink" xmlns:am3d="http://schemas.microsoft.com/office/drawing/2017/model3d" xmlns:o="urn:schemas-microsoft-com:office:office" xmlns:oel="http://schemas.microsoft.com/office/2019/extlst" xmlns:r="http://schemas.openxmlformats.org/officeDocument/2006/relationships" xmlns:m="http://schemas.openxmlformats.org/officeDocument/2006/math" xmlns:v="urn:schemas-microsoft-com:vml" xmlns:wp14="http://schemas.microsoft.com/office/word/2010/wordprocessingDrawing" xmlns:wp="http://schemas.openxmlformats.org/drawingml/2006/wordprocessingDrawing" xmlns:w10="urn:schemas-microsoft-com:office:word" xmlns:w="http://schemas.openxmlformats.org/wordprocessingml/2006/main" xmlns:w14="http://schemas.microsoft.com/office/word/2010/wordml" xmlns:w15="http://schemas.microsoft.com/office/word/2012/wordml" xmlns:w16cex="http://schemas.microsoft.com/office/word/2018/wordml/cex" xmlns:w16cid="http://schemas.microsoft.com/office/word/2016/wordml/cid" xmlns:w16="http://schemas.microsoft.com/office/word/2018/wordml" xmlns:w16du="http://schemas.microsoft.com/office/word/2023/wordml/word16du" xmlns:w16sdtdh="http://schemas.microsoft.com/office/word/2020/wordml/sdtdatahash" xmlns:w16se="http://schemas.microsoft.com/office/word/2015/wordml/symex" xmlns:wpg="http://schemas.microsoft.com/office/word/2010/wordprocessingGroup" xmlns:wpi="http://schemas.microsoft.com/office/word/2010/wordprocessingInk" xmlns:wne="http://schemas.microsoft.com/office/word/2006/wordml" xmlns:wps="http://schemas.microsoft.com/office/word/2010/wordprocessingShape" mc:Ignorable="w14 w15 w16se w16cid w16 w16cex w16sdtdh w16du wp14">
+<w:endnotes xmlns:wpc="http://schemas.microsoft.com/office/word/2010/wordprocessingCanvas" xmlns:cx="http://schemas.microsoft.com/office/drawing/2014/chartex" xmlns:cx1="http://schemas.microsoft.com/office/drawing/2015/9/8/chartex" xmlns:cx2="http://schemas.microsoft.com/office/drawing/2015/10/21/chartex" xmlns:cx3="http://schemas.microsoft.com/office/drawing/2016/5/9/chartex" xmlns:cx4="http://schemas.microsoft.com/office/drawing/2016/5/10/chartex" xmlns:cx5="http://schemas.microsoft.com/office/drawing/2016/5/11/chartex" xmlns:cx6="http://schemas.microsoft.com/office/drawing/2016/5/12/chartex" xmlns:cx7="http://schemas.microsoft.com/office/drawing/2016/5/13/chartex" xmlns:cx8="http://schemas.microsoft.com/office/drawing/2016/5/14/chartex" xmlns:mc="http://schemas.openxmlformats.org/markup-compatibility/2006" xmlns:aink="http://schemas.microsoft.com/office/drawing/2016/ink" xmlns:am3d="http://schemas.microsoft.com/office/drawing/2017/model3d" xmlns:o="urn:schemas-microsoft-com:office:office" xmlns:oel="http://schemas.microsoft.com/office/2019/extlst" xmlns:r="http://schemas.openxmlformats.org/officeDocument/2006/relationships" xmlns:m="http://schemas.openxmlformats.org/officeDocument/2006/math" xmlns:v="urn:schemas-microsoft-com:vml" xmlns:wp14="http://schemas.microsoft.com/office/word/2010/wordprocessingDrawing" xmlns:wp="http://schemas.openxmlformats.org/drawingml/2006/wordprocessingDrawing" xmlns:w10="urn:schemas-microsoft-com:office:word" xmlns:w="http://schemas.openxmlformats.org/wordprocessingml/2006/main" xmlns:w14="http://schemas.microsoft.com/office/word/2010/wordml" xmlns:w15="http://schemas.microsoft.com/office/word/2012/wordml" xmlns:w16cex="http://schemas.microsoft.com/office/word/2018/wordml/cex" xmlns:w16cid="http://schemas.microsoft.com/office/word/2016/wordml/cid" xmlns:w16="http://schemas.microsoft.com/office/word/2018/wordml" xmlns:w16du="http://schemas.microsoft.com/office/word/2023/wordml/word16du" xmlns:w16sdtdh="http://schemas.microsoft.com/office/word/2020/wordml/sdtdatahash" xmlns:w16sdtfl="http://schemas.microsoft.com/office/word/2024/wordml/sdtformatlock" xmlns:w16se="http://schemas.microsoft.com/office/word/2015/wordml/symex" xmlns:wpg="http://schemas.microsoft.com/office/word/2010/wordprocessingGroup" xmlns:wpi="http://schemas.microsoft.com/office/word/2010/wordprocessingInk" xmlns:wne="http://schemas.microsoft.com/office/word/2006/wordml" xmlns:wps="http://schemas.microsoft.com/office/word/2010/wordprocessingShape" mc:Ignorable="w14 w15 w16se w16cid w16 w16cex w16sdtdh w16sdtfl w16du wp14">
   <w:endnote w:type="separator" w:id="-1">
     <w:p>
       <w:r>
@@ -5067,7 +5420,7 @@
 </file>
 
 <file path=word/footer1.xml><?xml version="1.0" encoding="utf-8"?>
-<w:ftr xmlns:wpc="http://schemas.microsoft.com/office/word/2010/wordprocessingCanvas" xmlns:cx="http://schemas.microsoft.com/office/drawing/2014/chartex" xmlns:cx1="http://schemas.microsoft.com/office/drawing/2015/9/8/chartex" xmlns:cx2="http://schemas.microsoft.com/office/drawing/2015/10/21/chartex" xmlns:cx3="http://schemas.microsoft.com/office/drawing/2016/5/9/chartex" xmlns:cx4="http://schemas.microsoft.com/office/drawing/2016/5/10/chartex" xmlns:cx5="http://schemas.microsoft.com/office/drawing/2016/5/11/chartex" xmlns:cx6="http://schemas.microsoft.com/office/drawing/2016/5/12/chartex" xmlns:cx7="http://schemas.microsoft.com/office/drawing/2016/5/13/chartex" xmlns:cx8="http://schemas.microsoft.com/office/drawing/2016/5/14/chartex" xmlns:mc="http://schemas.openxmlformats.org/markup-compatibility/2006" xmlns:aink="http://schemas.microsoft.com/office/drawing/2016/ink" xmlns:am3d="http://schemas.microsoft.com/office/drawing/2017/model3d" xmlns:o="urn:schemas-microsoft-com:office:office" xmlns:oel="http://schemas.microsoft.com/office/2019/extlst" xmlns:r="http://schemas.openxmlformats.org/officeDocument/2006/relationships" xmlns:m="http://schemas.openxmlformats.org/officeDocument/2006/math" xmlns:v="urn:schemas-microsoft-com:vml" xmlns:wp14="http://schemas.microsoft.com/office/word/2010/wordprocessingDrawing" xmlns:wp="http://schemas.openxmlformats.org/drawingml/2006/wordprocessingDrawing" xmlns:w10="urn:schemas-microsoft-com:office:word" xmlns:w="http://schemas.openxmlformats.org/wordprocessingml/2006/main" xmlns:w14="http://schemas.microsoft.com/office/word/2010/wordml" xmlns:w15="http://schemas.microsoft.com/office/word/2012/wordml" xmlns:w16cex="http://schemas.microsoft.com/office/word/2018/wordml/cex" xmlns:w16cid="http://schemas.microsoft.com/office/word/2016/wordml/cid" xmlns:w16="http://schemas.microsoft.com/office/word/2018/wordml" xmlns:w16du="http://schemas.microsoft.com/office/word/2023/wordml/word16du" xmlns:w16sdtdh="http://schemas.microsoft.com/office/word/2020/wordml/sdtdatahash" xmlns:w16se="http://schemas.microsoft.com/office/word/2015/wordml/symex" xmlns:wpg="http://schemas.microsoft.com/office/word/2010/wordprocessingGroup" xmlns:wpi="http://schemas.microsoft.com/office/word/2010/wordprocessingInk" xmlns:wne="http://schemas.microsoft.com/office/word/2006/wordml" xmlns:wps="http://schemas.microsoft.com/office/word/2010/wordprocessingShape" mc:Ignorable="w14 w15 w16se w16cid w16 w16cex w16sdtdh w16du wp14">
+<w:ftr xmlns:wpc="http://schemas.microsoft.com/office/word/2010/wordprocessingCanvas" xmlns:cx="http://schemas.microsoft.com/office/drawing/2014/chartex" xmlns:cx1="http://schemas.microsoft.com/office/drawing/2015/9/8/chartex" xmlns:cx2="http://schemas.microsoft.com/office/drawing/2015/10/21/chartex" xmlns:cx3="http://schemas.microsoft.com/office/drawing/2016/5/9/chartex" xmlns:cx4="http://schemas.microsoft.com/office/drawing/2016/5/10/chartex" xmlns:cx5="http://schemas.microsoft.com/office/drawing/2016/5/11/chartex" xmlns:cx6="http://schemas.microsoft.com/office/drawing/2016/5/12/chartex" xmlns:cx7="http://schemas.microsoft.com/office/drawing/2016/5/13/chartex" xmlns:cx8="http://schemas.microsoft.com/office/drawing/2016/5/14/chartex" xmlns:mc="http://schemas.openxmlformats.org/markup-compatibility/2006" xmlns:aink="http://schemas.microsoft.com/office/drawing/2016/ink" xmlns:am3d="http://schemas.microsoft.com/office/drawing/2017/model3d" xmlns:o="urn:schemas-microsoft-com:office:office" xmlns:oel="http://schemas.microsoft.com/office/2019/extlst" xmlns:r="http://schemas.openxmlformats.org/officeDocument/2006/relationships" xmlns:m="http://schemas.openxmlformats.org/officeDocument/2006/math" xmlns:v="urn:schemas-microsoft-com:vml" xmlns:wp14="http://schemas.microsoft.com/office/word/2010/wordprocessingDrawing" xmlns:wp="http://schemas.openxmlformats.org/drawingml/2006/wordprocessingDrawing" xmlns:w10="urn:schemas-microsoft-com:office:word" xmlns:w="http://schemas.openxmlformats.org/wordprocessingml/2006/main" xmlns:w14="http://schemas.microsoft.com/office/word/2010/wordml" xmlns:w15="http://schemas.microsoft.com/office/word/2012/wordml" xmlns:w16cex="http://schemas.microsoft.com/office/word/2018/wordml/cex" xmlns:w16cid="http://schemas.microsoft.com/office/word/2016/wordml/cid" xmlns:w16="http://schemas.microsoft.com/office/word/2018/wordml" xmlns:w16du="http://schemas.microsoft.com/office/word/2023/wordml/word16du" xmlns:w16sdtdh="http://schemas.microsoft.com/office/word/2020/wordml/sdtdatahash" xmlns:w16sdtfl="http://schemas.microsoft.com/office/word/2024/wordml/sdtformatlock" xmlns:w16se="http://schemas.microsoft.com/office/word/2015/wordml/symex" xmlns:wpg="http://schemas.microsoft.com/office/word/2010/wordprocessingGroup" xmlns:wpi="http://schemas.microsoft.com/office/word/2010/wordprocessingInk" xmlns:wne="http://schemas.microsoft.com/office/word/2006/wordml" xmlns:wps="http://schemas.microsoft.com/office/word/2010/wordprocessingShape" mc:Ignorable="w14 w15 w16se w16cid w16 w16cex w16sdtdh w16sdtfl w16du wp14">
   <w:sdt>
     <w:sdtPr>
       <w:rPr>
@@ -5119,7 +5472,7 @@
 </file>
 
 <file path=word/footer2.xml><?xml version="1.0" encoding="utf-8"?>
-<w:ftr xmlns:wpc="http://schemas.microsoft.com/office/word/2010/wordprocessingCanvas" xmlns:cx="http://schemas.microsoft.com/office/drawing/2014/chartex" xmlns:cx1="http://schemas.microsoft.com/office/drawing/2015/9/8/chartex" xmlns:cx2="http://schemas.microsoft.com/office/drawing/2015/10/21/chartex" xmlns:cx3="http://schemas.microsoft.com/office/drawing/2016/5/9/chartex" xmlns:cx4="http://schemas.microsoft.com/office/drawing/2016/5/10/chartex" xmlns:cx5="http://schemas.microsoft.com/office/drawing/2016/5/11/chartex" xmlns:cx6="http://schemas.microsoft.com/office/drawing/2016/5/12/chartex" xmlns:cx7="http://schemas.microsoft.com/office/drawing/2016/5/13/chartex" xmlns:cx8="http://schemas.microsoft.com/office/drawing/2016/5/14/chartex" xmlns:mc="http://schemas.openxmlformats.org/markup-compatibility/2006" xmlns:aink="http://schemas.microsoft.com/office/drawing/2016/ink" xmlns:am3d="http://schemas.microsoft.com/office/drawing/2017/model3d" xmlns:o="urn:schemas-microsoft-com:office:office" xmlns:oel="http://schemas.microsoft.com/office/2019/extlst" xmlns:r="http://schemas.openxmlformats.org/officeDocument/2006/relationships" xmlns:m="http://schemas.openxmlformats.org/officeDocument/2006/math" xmlns:v="urn:schemas-microsoft-com:vml" xmlns:wp14="http://schemas.microsoft.com/office/word/2010/wordprocessingDrawing" xmlns:wp="http://schemas.openxmlformats.org/drawingml/2006/wordprocessingDrawing" xmlns:w10="urn:schemas-microsoft-com:office:word" xmlns:w="http://schemas.openxmlformats.org/wordprocessingml/2006/main" xmlns:w14="http://schemas.microsoft.com/office/word/2010/wordml" xmlns:w15="http://schemas.microsoft.com/office/word/2012/wordml" xmlns:w16cex="http://schemas.microsoft.com/office/word/2018/wordml/cex" xmlns:w16cid="http://schemas.microsoft.com/office/word/2016/wordml/cid" xmlns:w16="http://schemas.microsoft.com/office/word/2018/wordml" xmlns:w16du="http://schemas.microsoft.com/office/word/2023/wordml/word16du" xmlns:w16sdtdh="http://schemas.microsoft.com/office/word/2020/wordml/sdtdatahash" xmlns:w16se="http://schemas.microsoft.com/office/word/2015/wordml/symex" xmlns:wpg="http://schemas.microsoft.com/office/word/2010/wordprocessingGroup" xmlns:wpi="http://schemas.microsoft.com/office/word/2010/wordprocessingInk" xmlns:wne="http://schemas.microsoft.com/office/word/2006/wordml" xmlns:wps="http://schemas.microsoft.com/office/word/2010/wordprocessingShape" mc:Ignorable="w14 w15 w16se w16cid w16 w16cex w16sdtdh w16du wp14">
+<w:ftr xmlns:wpc="http://schemas.microsoft.com/office/word/2010/wordprocessingCanvas" xmlns:cx="http://schemas.microsoft.com/office/drawing/2014/chartex" xmlns:cx1="http://schemas.microsoft.com/office/drawing/2015/9/8/chartex" xmlns:cx2="http://schemas.microsoft.com/office/drawing/2015/10/21/chartex" xmlns:cx3="http://schemas.microsoft.com/office/drawing/2016/5/9/chartex" xmlns:cx4="http://schemas.microsoft.com/office/drawing/2016/5/10/chartex" xmlns:cx5="http://schemas.microsoft.com/office/drawing/2016/5/11/chartex" xmlns:cx6="http://schemas.microsoft.com/office/drawing/2016/5/12/chartex" xmlns:cx7="http://schemas.microsoft.com/office/drawing/2016/5/13/chartex" xmlns:cx8="http://schemas.microsoft.com/office/drawing/2016/5/14/chartex" xmlns:mc="http://schemas.openxmlformats.org/markup-compatibility/2006" xmlns:aink="http://schemas.microsoft.com/office/drawing/2016/ink" xmlns:am3d="http://schemas.microsoft.com/office/drawing/2017/model3d" xmlns:o="urn:schemas-microsoft-com:office:office" xmlns:oel="http://schemas.microsoft.com/office/2019/extlst" xmlns:r="http://schemas.openxmlformats.org/officeDocument/2006/relationships" xmlns:m="http://schemas.openxmlformats.org/officeDocument/2006/math" xmlns:v="urn:schemas-microsoft-com:vml" xmlns:wp14="http://schemas.microsoft.com/office/word/2010/wordprocessingDrawing" xmlns:wp="http://schemas.openxmlformats.org/drawingml/2006/wordprocessingDrawing" xmlns:w10="urn:schemas-microsoft-com:office:word" xmlns:w="http://schemas.openxmlformats.org/wordprocessingml/2006/main" xmlns:w14="http://schemas.microsoft.com/office/word/2010/wordml" xmlns:w15="http://schemas.microsoft.com/office/word/2012/wordml" xmlns:w16cex="http://schemas.microsoft.com/office/word/2018/wordml/cex" xmlns:w16cid="http://schemas.microsoft.com/office/word/2016/wordml/cid" xmlns:w16="http://schemas.microsoft.com/office/word/2018/wordml" xmlns:w16du="http://schemas.microsoft.com/office/word/2023/wordml/word16du" xmlns:w16sdtdh="http://schemas.microsoft.com/office/word/2020/wordml/sdtdatahash" xmlns:w16sdtfl="http://schemas.microsoft.com/office/word/2024/wordml/sdtformatlock" xmlns:w16se="http://schemas.microsoft.com/office/word/2015/wordml/symex" xmlns:wpg="http://schemas.microsoft.com/office/word/2010/wordprocessingGroup" xmlns:wpi="http://schemas.microsoft.com/office/word/2010/wordprocessingInk" xmlns:wne="http://schemas.microsoft.com/office/word/2006/wordml" xmlns:wps="http://schemas.microsoft.com/office/word/2010/wordprocessingShape" mc:Ignorable="w14 w15 w16se w16cid w16 w16cex w16sdtdh w16sdtfl w16du wp14">
   <w:sdt>
     <w:sdtPr>
       <w:rPr>
@@ -5184,7 +5537,7 @@
 </file>
 
 <file path=word/footnotes.xml><?xml version="1.0" encoding="utf-8"?>
-<w:footnotes xmlns:wpc="http://schemas.microsoft.com/office/word/2010/wordprocessingCanvas" xmlns:cx="http://schemas.microsoft.com/office/drawing/2014/chartex" xmlns:cx1="http://schemas.microsoft.com/office/drawing/2015/9/8/chartex" xmlns:cx2="http://schemas.microsoft.com/office/drawing/2015/10/21/chartex" xmlns:cx3="http://schemas.microsoft.com/office/drawing/2016/5/9/chartex" xmlns:cx4="http://schemas.microsoft.com/office/drawing/2016/5/10/chartex" xmlns:cx5="http://schemas.microsoft.com/office/drawing/2016/5/11/chartex" xmlns:cx6="http://schemas.microsoft.com/office/drawing/2016/5/12/chartex" xmlns:cx7="http://schemas.microsoft.com/office/drawing/2016/5/13/chartex" xmlns:cx8="http://schemas.microsoft.com/office/drawing/2016/5/14/chartex" xmlns:mc="http://schemas.openxmlformats.org/markup-compatibility/2006" xmlns:aink="http://schemas.microsoft.com/office/drawing/2016/ink" xmlns:am3d="http://schemas.microsoft.com/office/drawing/2017/model3d" xmlns:o="urn:schemas-microsoft-com:office:office" xmlns:oel="http://schemas.microsoft.com/office/2019/extlst" xmlns:r="http://schemas.openxmlformats.org/officeDocument/2006/relationships" xmlns:m="http://schemas.openxmlformats.org/officeDocument/2006/math" xmlns:v="urn:schemas-microsoft-com:vml" xmlns:wp14="http://schemas.microsoft.com/office/word/2010/wordprocessingDrawing" xmlns:wp="http://schemas.openxmlformats.org/drawingml/2006/wordprocessingDrawing" xmlns:w10="urn:schemas-microsoft-com:office:word" xmlns:w="http://schemas.openxmlformats.org/wordprocessingml/2006/main" xmlns:w14="http://schemas.microsoft.com/office/word/2010/wordml" xmlns:w15="http://schemas.microsoft.com/office/word/2012/wordml" xmlns:w16cex="http://schemas.microsoft.com/office/word/2018/wordml/cex" xmlns:w16cid="http://schemas.microsoft.com/office/word/2016/wordml/cid" xmlns:w16="http://schemas.microsoft.com/office/word/2018/wordml" xmlns:w16du="http://schemas.microsoft.com/office/word/2023/wordml/word16du" xmlns:w16sdtdh="http://schemas.microsoft.com/office/word/2020/wordml/sdtdatahash" xmlns:w16se="http://schemas.microsoft.com/office/word/2015/wordml/symex" xmlns:wpg="http://schemas.microsoft.com/office/word/2010/wordprocessingGroup" xmlns:wpi="http://schemas.microsoft.com/office/word/2010/wordprocessingInk" xmlns:wne="http://schemas.microsoft.com/office/word/2006/wordml" xmlns:wps="http://schemas.microsoft.com/office/word/2010/wordprocessingShape" mc:Ignorable="w14 w15 w16se w16cid w16 w16cex w16sdtdh w16du wp14">
+<w:footnotes xmlns:wpc="http://schemas.microsoft.com/office/word/2010/wordprocessingCanvas" xmlns:cx="http://schemas.microsoft.com/office/drawing/2014/chartex" xmlns:cx1="http://schemas.microsoft.com/office/drawing/2015/9/8/chartex" xmlns:cx2="http://schemas.microsoft.com/office/drawing/2015/10/21/chartex" xmlns:cx3="http://schemas.microsoft.com/office/drawing/2016/5/9/chartex" xmlns:cx4="http://schemas.microsoft.com/office/drawing/2016/5/10/chartex" xmlns:cx5="http://schemas.microsoft.com/office/drawing/2016/5/11/chartex" xmlns:cx6="http://schemas.microsoft.com/office/drawing/2016/5/12/chartex" xmlns:cx7="http://schemas.microsoft.com/office/drawing/2016/5/13/chartex" xmlns:cx8="http://schemas.microsoft.com/office/drawing/2016/5/14/chartex" xmlns:mc="http://schemas.openxmlformats.org/markup-compatibility/2006" xmlns:aink="http://schemas.microsoft.com/office/drawing/2016/ink" xmlns:am3d="http://schemas.microsoft.com/office/drawing/2017/model3d" xmlns:o="urn:schemas-microsoft-com:office:office" xmlns:oel="http://schemas.microsoft.com/office/2019/extlst" xmlns:r="http://schemas.openxmlformats.org/officeDocument/2006/relationships" xmlns:m="http://schemas.openxmlformats.org/officeDocument/2006/math" xmlns:v="urn:schemas-microsoft-com:vml" xmlns:wp14="http://schemas.microsoft.com/office/word/2010/wordprocessingDrawing" xmlns:wp="http://schemas.openxmlformats.org/drawingml/2006/wordprocessingDrawing" xmlns:w10="urn:schemas-microsoft-com:office:word" xmlns:w="http://schemas.openxmlformats.org/wordprocessingml/2006/main" xmlns:w14="http://schemas.microsoft.com/office/word/2010/wordml" xmlns:w15="http://schemas.microsoft.com/office/word/2012/wordml" xmlns:w16cex="http://schemas.microsoft.com/office/word/2018/wordml/cex" xmlns:w16cid="http://schemas.microsoft.com/office/word/2016/wordml/cid" xmlns:w16="http://schemas.microsoft.com/office/word/2018/wordml" xmlns:w16du="http://schemas.microsoft.com/office/word/2023/wordml/word16du" xmlns:w16sdtdh="http://schemas.microsoft.com/office/word/2020/wordml/sdtdatahash" xmlns:w16sdtfl="http://schemas.microsoft.com/office/word/2024/wordml/sdtformatlock" xmlns:w16se="http://schemas.microsoft.com/office/word/2015/wordml/symex" xmlns:wpg="http://schemas.microsoft.com/office/word/2010/wordprocessingGroup" xmlns:wpi="http://schemas.microsoft.com/office/word/2010/wordprocessingInk" xmlns:wne="http://schemas.microsoft.com/office/word/2006/wordml" xmlns:wps="http://schemas.microsoft.com/office/word/2010/wordprocessingShape" mc:Ignorable="w14 w15 w16se w16cid w16 w16cex w16sdtdh w16sdtfl w16du wp14">
   <w:footnote w:type="separator" w:id="-1">
     <w:p>
       <w:r>
@@ -5203,7 +5556,7 @@
 </file>
 
 <file path=word/header1.xml><?xml version="1.0" encoding="utf-8"?>
-<w:hdr xmlns:wpc="http://schemas.microsoft.com/office/word/2010/wordprocessingCanvas" xmlns:cx="http://schemas.microsoft.com/office/drawing/2014/chartex" xmlns:cx1="http://schemas.microsoft.com/office/drawing/2015/9/8/chartex" xmlns:cx2="http://schemas.microsoft.com/office/drawing/2015/10/21/chartex" xmlns:cx3="http://schemas.microsoft.com/office/drawing/2016/5/9/chartex" xmlns:cx4="http://schemas.microsoft.com/office/drawing/2016/5/10/chartex" xmlns:cx5="http://schemas.microsoft.com/office/drawing/2016/5/11/chartex" xmlns:cx6="http://schemas.microsoft.com/office/drawing/2016/5/12/chartex" xmlns:cx7="http://schemas.microsoft.com/office/drawing/2016/5/13/chartex" xmlns:cx8="http://schemas.microsoft.com/office/drawing/2016/5/14/chartex" xmlns:mc="http://schemas.openxmlformats.org/markup-compatibility/2006" xmlns:aink="http://schemas.microsoft.com/office/drawing/2016/ink" xmlns:am3d="http://schemas.microsoft.com/office/drawing/2017/model3d" xmlns:o="urn:schemas-microsoft-com:office:office" xmlns:oel="http://schemas.microsoft.com/office/2019/extlst" xmlns:r="http://schemas.openxmlformats.org/officeDocument/2006/relationships" xmlns:m="http://schemas.openxmlformats.org/officeDocument/2006/math" xmlns:v="urn:schemas-microsoft-com:vml" xmlns:wp14="http://schemas.microsoft.com/office/word/2010/wordprocessingDrawing" xmlns:wp="http://schemas.openxmlformats.org/drawingml/2006/wordprocessingDrawing" xmlns:w10="urn:schemas-microsoft-com:office:word" xmlns:w="http://schemas.openxmlformats.org/wordprocessingml/2006/main" xmlns:w14="http://schemas.microsoft.com/office/word/2010/wordml" xmlns:w15="http://schemas.microsoft.com/office/word/2012/wordml" xmlns:w16cex="http://schemas.microsoft.com/office/word/2018/wordml/cex" xmlns:w16cid="http://schemas.microsoft.com/office/word/2016/wordml/cid" xmlns:w16="http://schemas.microsoft.com/office/word/2018/wordml" xmlns:w16du="http://schemas.microsoft.com/office/word/2023/wordml/word16du" xmlns:w16sdtdh="http://schemas.microsoft.com/office/word/2020/wordml/sdtdatahash" xmlns:w16se="http://schemas.microsoft.com/office/word/2015/wordml/symex" xmlns:wpg="http://schemas.microsoft.com/office/word/2010/wordprocessingGroup" xmlns:wpi="http://schemas.microsoft.com/office/word/2010/wordprocessingInk" xmlns:wne="http://schemas.microsoft.com/office/word/2006/wordml" xmlns:wps="http://schemas.microsoft.com/office/word/2010/wordprocessingShape" mc:Ignorable="w14 w15 w16se w16cid w16 w16cex w16sdtdh w16du wp14">
+<w:hdr xmlns:wpc="http://schemas.microsoft.com/office/word/2010/wordprocessingCanvas" xmlns:cx="http://schemas.microsoft.com/office/drawing/2014/chartex" xmlns:cx1="http://schemas.microsoft.com/office/drawing/2015/9/8/chartex" xmlns:cx2="http://schemas.microsoft.com/office/drawing/2015/10/21/chartex" xmlns:cx3="http://schemas.microsoft.com/office/drawing/2016/5/9/chartex" xmlns:cx4="http://schemas.microsoft.com/office/drawing/2016/5/10/chartex" xmlns:cx5="http://schemas.microsoft.com/office/drawing/2016/5/11/chartex" xmlns:cx6="http://schemas.microsoft.com/office/drawing/2016/5/12/chartex" xmlns:cx7="http://schemas.microsoft.com/office/drawing/2016/5/13/chartex" xmlns:cx8="http://schemas.microsoft.com/office/drawing/2016/5/14/chartex" xmlns:mc="http://schemas.openxmlformats.org/markup-compatibility/2006" xmlns:aink="http://schemas.microsoft.com/office/drawing/2016/ink" xmlns:am3d="http://schemas.microsoft.com/office/drawing/2017/model3d" xmlns:o="urn:schemas-microsoft-com:office:office" xmlns:oel="http://schemas.microsoft.com/office/2019/extlst" xmlns:r="http://schemas.openxmlformats.org/officeDocument/2006/relationships" xmlns:m="http://schemas.openxmlformats.org/officeDocument/2006/math" xmlns:v="urn:schemas-microsoft-com:vml" xmlns:wp14="http://schemas.microsoft.com/office/word/2010/wordprocessingDrawing" xmlns:wp="http://schemas.openxmlformats.org/drawingml/2006/wordprocessingDrawing" xmlns:w10="urn:schemas-microsoft-com:office:word" xmlns:w="http://schemas.openxmlformats.org/wordprocessingml/2006/main" xmlns:w14="http://schemas.microsoft.com/office/word/2010/wordml" xmlns:w15="http://schemas.microsoft.com/office/word/2012/wordml" xmlns:w16cex="http://schemas.microsoft.com/office/word/2018/wordml/cex" xmlns:w16cid="http://schemas.microsoft.com/office/word/2016/wordml/cid" xmlns:w16="http://schemas.microsoft.com/office/word/2018/wordml" xmlns:w16du="http://schemas.microsoft.com/office/word/2023/wordml/word16du" xmlns:w16sdtdh="http://schemas.microsoft.com/office/word/2020/wordml/sdtdatahash" xmlns:w16sdtfl="http://schemas.microsoft.com/office/word/2024/wordml/sdtformatlock" xmlns:w16se="http://schemas.microsoft.com/office/word/2015/wordml/symex" xmlns:wpg="http://schemas.microsoft.com/office/word/2010/wordprocessingGroup" xmlns:wpi="http://schemas.microsoft.com/office/word/2010/wordprocessingInk" xmlns:wne="http://schemas.microsoft.com/office/word/2006/wordml" xmlns:wps="http://schemas.microsoft.com/office/word/2010/wordprocessingShape" mc:Ignorable="w14 w15 w16se w16cid w16 w16cex w16sdtdh w16sdtfl w16du wp14">
   <w:p>
     <w:pPr>
       <w:pStyle w:val="Header"/>
@@ -5256,7 +5609,7 @@
 </file>
 
 <file path=word/numbering.xml><?xml version="1.0" encoding="utf-8"?>
-<w:numbering xmlns:wpc="http://schemas.microsoft.com/office/word/2010/wordprocessingCanvas" xmlns:cx="http://schemas.microsoft.com/office/drawing/2014/chartex" xmlns:cx1="http://schemas.microsoft.com/office/drawing/2015/9/8/chartex" xmlns:cx2="http://schemas.microsoft.com/office/drawing/2015/10/21/chartex" xmlns:cx3="http://schemas.microsoft.com/office/drawing/2016/5/9/chartex" xmlns:cx4="http://schemas.microsoft.com/office/drawing/2016/5/10/chartex" xmlns:cx5="http://schemas.microsoft.com/office/drawing/2016/5/11/chartex" xmlns:cx6="http://schemas.microsoft.com/office/drawing/2016/5/12/chartex" xmlns:cx7="http://schemas.microsoft.com/office/drawing/2016/5/13/chartex" xmlns:cx8="http://schemas.microsoft.com/office/drawing/2016/5/14/chartex" xmlns:mc="http://schemas.openxmlformats.org/markup-compatibility/2006" xmlns:aink="http://schemas.microsoft.com/office/drawing/2016/ink" xmlns:am3d="http://schemas.microsoft.com/office/drawing/2017/model3d" xmlns:o="urn:schemas-microsoft-com:office:office" xmlns:oel="http://schemas.microsoft.com/office/2019/extlst" xmlns:r="http://schemas.openxmlformats.org/officeDocument/2006/relationships" xmlns:m="http://schemas.openxmlformats.org/officeDocument/2006/math" xmlns:v="urn:schemas-microsoft-com:vml" xmlns:wp14="http://schemas.microsoft.com/office/word/2010/wordprocessingDrawing" xmlns:wp="http://schemas.openxmlformats.org/drawingml/2006/wordprocessingDrawing" xmlns:w10="urn:schemas-microsoft-com:office:word" xmlns:w="http://schemas.openxmlformats.org/wordprocessingml/2006/main" xmlns:w14="http://schemas.microsoft.com/office/word/2010/wordml" xmlns:w15="http://schemas.microsoft.com/office/word/2012/wordml" xmlns:w16cex="http://schemas.microsoft.com/office/word/2018/wordml/cex" xmlns:w16cid="http://schemas.microsoft.com/office/word/2016/wordml/cid" xmlns:w16="http://schemas.microsoft.com/office/word/2018/wordml" xmlns:w16du="http://schemas.microsoft.com/office/word/2023/wordml/word16du" xmlns:w16sdtdh="http://schemas.microsoft.com/office/word/2020/wordml/sdtdatahash" xmlns:w16se="http://schemas.microsoft.com/office/word/2015/wordml/symex" xmlns:wpg="http://schemas.microsoft.com/office/word/2010/wordprocessingGroup" xmlns:wpi="http://schemas.microsoft.com/office/word/2010/wordprocessingInk" xmlns:wne="http://schemas.microsoft.com/office/word/2006/wordml" xmlns:wps="http://schemas.microsoft.com/office/word/2010/wordprocessingShape" mc:Ignorable="w14 w15 w16se w16cid w16 w16cex w16sdtdh w16du wp14">
+<w:numbering xmlns:wpc="http://schemas.microsoft.com/office/word/2010/wordprocessingCanvas" xmlns:cx="http://schemas.microsoft.com/office/drawing/2014/chartex" xmlns:cx1="http://schemas.microsoft.com/office/drawing/2015/9/8/chartex" xmlns:cx2="http://schemas.microsoft.com/office/drawing/2015/10/21/chartex" xmlns:cx3="http://schemas.microsoft.com/office/drawing/2016/5/9/chartex" xmlns:cx4="http://schemas.microsoft.com/office/drawing/2016/5/10/chartex" xmlns:cx5="http://schemas.microsoft.com/office/drawing/2016/5/11/chartex" xmlns:cx6="http://schemas.microsoft.com/office/drawing/2016/5/12/chartex" xmlns:cx7="http://schemas.microsoft.com/office/drawing/2016/5/13/chartex" xmlns:cx8="http://schemas.microsoft.com/office/drawing/2016/5/14/chartex" xmlns:mc="http://schemas.openxmlformats.org/markup-compatibility/2006" xmlns:aink="http://schemas.microsoft.com/office/drawing/2016/ink" xmlns:am3d="http://schemas.microsoft.com/office/drawing/2017/model3d" xmlns:o="urn:schemas-microsoft-com:office:office" xmlns:oel="http://schemas.microsoft.com/office/2019/extlst" xmlns:r="http://schemas.openxmlformats.org/officeDocument/2006/relationships" xmlns:m="http://schemas.openxmlformats.org/officeDocument/2006/math" xmlns:v="urn:schemas-microsoft-com:vml" xmlns:wp14="http://schemas.microsoft.com/office/word/2010/wordprocessingDrawing" xmlns:wp="http://schemas.openxmlformats.org/drawingml/2006/wordprocessingDrawing" xmlns:w10="urn:schemas-microsoft-com:office:word" xmlns:w="http://schemas.openxmlformats.org/wordprocessingml/2006/main" xmlns:w14="http://schemas.microsoft.com/office/word/2010/wordml" xmlns:w15="http://schemas.microsoft.com/office/word/2012/wordml" xmlns:w16cex="http://schemas.microsoft.com/office/word/2018/wordml/cex" xmlns:w16cid="http://schemas.microsoft.com/office/word/2016/wordml/cid" xmlns:w16="http://schemas.microsoft.com/office/word/2018/wordml" xmlns:w16du="http://schemas.microsoft.com/office/word/2023/wordml/word16du" xmlns:w16sdtdh="http://schemas.microsoft.com/office/word/2020/wordml/sdtdatahash" xmlns:w16sdtfl="http://schemas.microsoft.com/office/word/2024/wordml/sdtformatlock" xmlns:w16se="http://schemas.microsoft.com/office/word/2015/wordml/symex" xmlns:wpg="http://schemas.microsoft.com/office/word/2010/wordprocessingGroup" xmlns:wpi="http://schemas.microsoft.com/office/word/2010/wordprocessingInk" xmlns:wne="http://schemas.microsoft.com/office/word/2006/wordml" xmlns:wps="http://schemas.microsoft.com/office/word/2010/wordprocessingShape" mc:Ignorable="w14 w15 w16se w16cid w16 w16cex w16sdtdh w16sdtfl w16du wp14">
   <w:abstractNum w:abstractNumId="0" w15:restartNumberingAfterBreak="0">
     <w:nsid w:val="651D5685"/>
     <w:multiLevelType w:val="multilevel"/>
@@ -5413,7 +5766,7 @@
 </file>
 
 <file path=word/styles.xml><?xml version="1.0" encoding="utf-8"?>
-<w:styles xmlns:mc="http://schemas.openxmlformats.org/markup-compatibility/2006" xmlns:r="http://schemas.openxmlformats.org/officeDocument/2006/relationships" xmlns:w="http://schemas.openxmlformats.org/wordprocessingml/2006/main" xmlns:w14="http://schemas.microsoft.com/office/word/2010/wordml" xmlns:w15="http://schemas.microsoft.com/office/word/2012/wordml" xmlns:w16cex="http://schemas.microsoft.com/office/word/2018/wordml/cex" xmlns:w16cid="http://schemas.microsoft.com/office/word/2016/wordml/cid" xmlns:w16="http://schemas.microsoft.com/office/word/2018/wordml" xmlns:w16du="http://schemas.microsoft.com/office/word/2023/wordml/word16du" xmlns:w16sdtdh="http://schemas.microsoft.com/office/word/2020/wordml/sdtdatahash" xmlns:w16se="http://schemas.microsoft.com/office/word/2015/wordml/symex" mc:Ignorable="w14 w15 w16se w16cid w16 w16cex w16sdtdh w16du">
+<w:styles xmlns:mc="http://schemas.openxmlformats.org/markup-compatibility/2006" xmlns:r="http://schemas.openxmlformats.org/officeDocument/2006/relationships" xmlns:w="http://schemas.openxmlformats.org/wordprocessingml/2006/main" xmlns:w14="http://schemas.microsoft.com/office/word/2010/wordml" xmlns:w15="http://schemas.microsoft.com/office/word/2012/wordml" xmlns:w16cex="http://schemas.microsoft.com/office/word/2018/wordml/cex" xmlns:w16cid="http://schemas.microsoft.com/office/word/2016/wordml/cid" xmlns:w16="http://schemas.microsoft.com/office/word/2018/wordml" xmlns:w16du="http://schemas.microsoft.com/office/word/2023/wordml/word16du" xmlns:w16sdtdh="http://schemas.microsoft.com/office/word/2020/wordml/sdtdatahash" xmlns:w16sdtfl="http://schemas.microsoft.com/office/word/2024/wordml/sdtformatlock" xmlns:w16se="http://schemas.microsoft.com/office/word/2015/wordml/symex" mc:Ignorable="w14 w15 w16se w16cid w16 w16cex w16sdtdh w16sdtfl w16du">
   <w:docDefaults>
     <w:rPrDefault>
       <w:rPr>

</xml_diff>